<commit_message>
Update scope docs: merge hipot+functional module, connection & inspection changes
Applied to both the English Definitions and the Portuguese Escopo,
keeping the original theme/formatting/style:
- Merge the hipot and functional tests into a single combined module;
  power connections separated from control/IO. Hipot runs first with
  only power connected, then control/IO is connected for the functional
  test (power+control).
- Product-to-pallet connection described as semi-automated; visual
  inspection limited to verifying the HMI works correctly.
- Remove the fixture/pallet return conveyor (forward conveyor only).
- Update the operational flow accordingly.

Co-Authored-By: Claude Opus 4.8 <noreply@anthropic.com>
Claude-Session: https://claude.ai/code/session_01XCyDZxfZxZ3SBQAJkRpEXx
</commit_message>
<xml_diff>
--- a/Escopo Sistema de testes modular All Drives.docx
+++ b/Escopo Sistema de testes modular All Drives.docx
@@ -192,55 +192,7 @@
           <w:sz w:val="20"/>
           <w:szCs w:val="20"/>
         </w:rPr>
-        <w:t xml:space="preserve">Dentro deste conceito, o presente escopo tem como objetivo a fabricação de </w:t>
-      </w:r>
-      <w:r>
-        <w:rPr>
-          <w:rFonts w:ascii="Arial" w:hAnsi="Arial" w:cs="Arial"/>
-          <w:sz w:val="20"/>
-          <w:szCs w:val="20"/>
-        </w:rPr>
-        <w:t>três</w:t>
-      </w:r>
-      <w:r>
-        <w:rPr>
-          <w:rFonts w:ascii="Arial" w:hAnsi="Arial" w:cs="Arial"/>
-          <w:sz w:val="20"/>
-          <w:szCs w:val="20"/>
-        </w:rPr>
-        <w:t xml:space="preserve"> módulos principais de teste: </w:t>
-      </w:r>
-      <w:r>
-        <w:rPr>
-          <w:rFonts w:ascii="Arial" w:hAnsi="Arial" w:cs="Arial"/>
-          <w:sz w:val="20"/>
-          <w:szCs w:val="20"/>
-        </w:rPr>
-        <w:t xml:space="preserve">um módulo de teste de tensão aplicada, para garantir a isolação elétrica das conexões de potência dos drives, </w:t>
-      </w:r>
-      <w:r>
-        <w:rPr>
-          <w:rFonts w:ascii="Arial" w:hAnsi="Arial" w:cs="Arial"/>
-          <w:sz w:val="20"/>
-          <w:szCs w:val="20"/>
-        </w:rPr>
-        <w:t xml:space="preserve">um módulo de teste funcional, responsável pela validação elétrica, lógica e operacional dos produtos, e um módulo de teste de carga, destinado à simulação de condições reais de operação através da aplicação de carga controlada nos </w:t>
-      </w:r>
-      <w:r>
-        <w:rPr>
-          <w:rFonts w:ascii="Arial" w:hAnsi="Arial" w:cs="Arial"/>
-          <w:sz w:val="20"/>
-          <w:szCs w:val="20"/>
-        </w:rPr>
-        <w:t>drives</w:t>
-      </w:r>
-      <w:r>
-        <w:rPr>
-          <w:rFonts w:ascii="Arial" w:hAnsi="Arial" w:cs="Arial"/>
-          <w:sz w:val="20"/>
-          <w:szCs w:val="20"/>
-        </w:rPr>
-        <w:t xml:space="preserve"> testados.</w:t>
+        <w:t>Dentro deste conceito, o presente escopo tem como objetivo a fabricação de dois módulos principais de teste: um módulo combinado de teste de tensão aplicada e teste funcional, responsável tanto por garantir a isolação elétrica das conexões de potência dos drives (tensão aplicada) quanto pela validação elétrica, lógica e operacional dos produtos (funcional), e um módulo de teste de carga, destinado à simulação de condições reais de operação através da aplicação de carga controlada nos drives testados.</w:t>
       </w:r>
     </w:p>
     <w:p>
@@ -339,43 +291,7 @@
           <w:szCs w:val="20"/>
           <w:lang w:eastAsia="en-US"/>
         </w:rPr>
-        <w:t>O projeto refere-se ao fornecimento de um</w:t>
-      </w:r>
-      <w:r>
-        <w:rPr>
-          <w:rFonts w:eastAsia="Calibri" w:cs="Arial"/>
-          <w:sz w:val="20"/>
-          <w:szCs w:val="20"/>
-          <w:lang w:eastAsia="en-US"/>
-        </w:rPr>
-        <w:t xml:space="preserve"> módulo de teste de tensão aplicada, um</w:t>
-      </w:r>
-      <w:r>
-        <w:rPr>
-          <w:rFonts w:eastAsia="Calibri" w:cs="Arial"/>
-          <w:sz w:val="20"/>
-          <w:szCs w:val="20"/>
-          <w:lang w:eastAsia="en-US"/>
-        </w:rPr>
-        <w:t xml:space="preserve"> módulo de teste funcional </w:t>
-      </w:r>
-      <w:r>
-        <w:rPr>
-          <w:rFonts w:eastAsia="Calibri" w:cs="Arial"/>
-          <w:sz w:val="20"/>
-          <w:szCs w:val="20"/>
-          <w:lang w:eastAsia="en-US"/>
-        </w:rPr>
-        <w:t xml:space="preserve">e um módulo de teste de carga </w:t>
-      </w:r>
-      <w:r>
-        <w:rPr>
-          <w:rFonts w:eastAsia="Calibri" w:cs="Arial"/>
-          <w:sz w:val="20"/>
-          <w:szCs w:val="20"/>
-          <w:lang w:eastAsia="en-US"/>
-        </w:rPr>
-        <w:t>automatizado destinado à validação das funcionalidades dos produtos da linha Orion mecânicas A, B e C, bem como produtos similares.</w:t>
+        <w:t>O projeto refere-se ao fornecimento de um módulo combinado de teste de tensão aplicada e teste funcional e um módulo de teste de carga automatizado destinado à validação das funcionalidades dos produtos da linha Orion mecânicas A, B e C, bem como produtos similares.</w:t>
       </w:r>
     </w:p>
     <w:p>
@@ -410,7 +326,7 @@
           <w:szCs w:val="22"/>
           <w:lang w:eastAsia="en-US"/>
         </w:rPr>
-        <w:t>Módulo de teste de tensão aplicada:</w:t>
+        <w:t>Módulo de teste de tensão aplicada e funcional:</w:t>
       </w:r>
     </w:p>
     <w:p>
@@ -445,15 +361,7 @@
           <w:lang w:eastAsia="en-US"/>
         </w:rPr>
         <w:tab/>
-      </w:r>
-      <w:r>
-        <w:rPr>
-          <w:rFonts w:eastAsia="Calibri" w:cs="Arial"/>
-          <w:sz w:val="20"/>
-          <w:szCs w:val="20"/>
-          <w:lang w:eastAsia="en-US"/>
-        </w:rPr>
-        <w:t>O módulo de teste de tensão aplicada consiste em uma estação dedicada à execução dos ensaios dielétricos dos produtos da linha Orion e similares mecânicas A, B e C, com o objetivo de validar a integridade do isolamento elétrico e garantir a conformidade do produto com os requisitos de segurança elétrica estabelecidos pelas especificações técnicas aplicáveis.</w:t>
+        <w:t>O módulo de teste de tensão aplicada e funcional consiste em uma única estação dedicada à execução tanto do ensaio dielétrico (tensão aplicada) quanto do teste funcional dos produtos da linha Orion e similares mecânicas A, B e C. Neste módulo as conexões de potência são separadas das conexões de controle/IO: o teste de tensão aplicada é executado primeiro utilizando apenas as conexões de potência e, em seguida, as conexões de controle/IO são acopladas e o teste funcional é executado com as conexões de potência e de controle. Durante o teste de tensão aplicada apenas as conexões de potência deverão estar conectadas; durante o teste funcional tanto as conexões de potência quanto as de controle deverão estar conectadas. A etapa de tensão aplicada valida a integridade do isolamento elétrico e garante a conformidade do produto com os requisitos de segurança elétrica estabelecidos pelas especificações técnicas aplicáveis.</w:t>
       </w:r>
     </w:p>
     <w:p>
@@ -706,7 +614,7 @@
           <w:szCs w:val="22"/>
           <w:lang w:eastAsia="en-US"/>
         </w:rPr>
-        <w:t>Módulo de teste funcional:</w:t>
+        <w:t>Etapa de teste funcional:</w:t>
       </w:r>
     </w:p>
     <w:p>
@@ -738,39 +646,7 @@
           <w:sz w:val="20"/>
           <w:szCs w:val="20"/>
         </w:rPr>
-        <w:t xml:space="preserve">O conceito proposto consiste em um módulo de testes compacto, modular e escalável, desenvolvido para executar rotinas de teste funcional nos produtos, garantindo que todas as funcionalidades </w:t>
-      </w:r>
-      <w:r>
-        <w:rPr>
-          <w:rFonts w:ascii="Arial" w:hAnsi="Arial" w:cs="Arial"/>
-          <w:sz w:val="20"/>
-          <w:szCs w:val="20"/>
-        </w:rPr>
-        <w:t xml:space="preserve">do drive </w:t>
-      </w:r>
-      <w:r>
-        <w:rPr>
-          <w:rFonts w:ascii="Arial" w:hAnsi="Arial" w:cs="Arial"/>
-          <w:sz w:val="20"/>
-          <w:szCs w:val="20"/>
-        </w:rPr>
-        <w:t>estejam de acordo com as especificações de teste e que o</w:t>
-      </w:r>
-      <w:r>
-        <w:rPr>
-          <w:rFonts w:ascii="Arial" w:hAnsi="Arial" w:cs="Arial"/>
-          <w:sz w:val="20"/>
-          <w:szCs w:val="20"/>
-        </w:rPr>
-        <w:t xml:space="preserve"> produto</w:t>
-      </w:r>
-      <w:r>
-        <w:rPr>
-          <w:rFonts w:ascii="Arial" w:hAnsi="Arial" w:cs="Arial"/>
-          <w:sz w:val="20"/>
-          <w:szCs w:val="20"/>
-        </w:rPr>
-        <w:t xml:space="preserve"> seja considerado aprovado para utilização.</w:t>
+        <w:t>O conceito proposto consiste em uma etapa de testes compacta, modular e escalável, desenvolvida para executar rotinas de teste funcional nos produtos, garantindo que todas as funcionalidades do drive estejam de acordo com as especificações de teste e que o produto seja considerado aprovado para utilização.</w:t>
       </w:r>
     </w:p>
     <w:p>
@@ -904,7 +780,7 @@
           <w:sz w:val="20"/>
           <w:szCs w:val="20"/>
         </w:rPr>
-        <w:t>Além disso, o módulo deverá contar com um sistema de visão integrado, permitindo a visualização da IHM e de demais regiões sensíveis do drive, possibilitando inspeções automáticas e validações visuais que serão detalhadas posteriormente conforme o avanço do projeto.</w:t>
+        <w:t>Além disso, o módulo deverá contar com um sistema de visão integrado aplicado apenas para verificar se a IHM está funcionando corretamente.</w:t>
       </w:r>
     </w:p>
     <w:p>
@@ -2499,71 +2375,6 @@
           <w:lang w:eastAsia="en-US"/>
         </w:rPr>
         <w:t>O design mecânico dos módulos deverá ser o mais enxuto possível pensando em economia de área fabril;</w:t>
-      </w:r>
-    </w:p>
-    <w:p>
-      <w:pPr>
-        <w:numPr>
-          <w:ilvl w:val="0"/>
-          <w:numId w:val="51"/>
-        </w:numPr>
-        <w:spacing w:line="360" w:lineRule="auto"/>
-        <w:jc w:val="both"/>
-        <w:rPr>
-          <w:rFonts w:eastAsia="Calibri" w:cs="Arial"/>
-          <w:sz w:val="20"/>
-          <w:szCs w:val="20"/>
-          <w:lang w:eastAsia="en-US"/>
-        </w:rPr>
-      </w:pPr>
-      <w:r>
-        <w:rPr>
-          <w:rFonts w:eastAsia="Calibri" w:cs="Arial"/>
-          <w:sz w:val="20"/>
-          <w:szCs w:val="20"/>
-          <w:lang w:eastAsia="en-US"/>
-        </w:rPr>
-        <w:t xml:space="preserve">Esteira de retorno de </w:t>
-      </w:r>
-      <w:proofErr w:type="spellStart"/>
-      <w:r>
-        <w:rPr>
-          <w:rFonts w:eastAsia="Calibri" w:cs="Arial"/>
-          <w:sz w:val="20"/>
-          <w:szCs w:val="20"/>
-          <w:lang w:eastAsia="en-US"/>
-        </w:rPr>
-        <w:t>fixture</w:t>
-      </w:r>
-      <w:proofErr w:type="spellEnd"/>
-      <w:r>
-        <w:rPr>
-          <w:rFonts w:eastAsia="Calibri" w:cs="Arial"/>
-          <w:sz w:val="20"/>
-          <w:szCs w:val="20"/>
-          <w:lang w:eastAsia="en-US"/>
-        </w:rPr>
-        <w:t xml:space="preserve"> na parte inferior, onde o operador ou um elevador no fim da linha vai posicionar o </w:t>
-      </w:r>
-      <w:proofErr w:type="spellStart"/>
-      <w:r>
-        <w:rPr>
-          <w:rFonts w:eastAsia="Calibri" w:cs="Arial"/>
-          <w:sz w:val="20"/>
-          <w:szCs w:val="20"/>
-          <w:lang w:eastAsia="en-US"/>
-        </w:rPr>
-        <w:t>fixture</w:t>
-      </w:r>
-      <w:proofErr w:type="spellEnd"/>
-      <w:r>
-        <w:rPr>
-          <w:rFonts w:eastAsia="Calibri" w:cs="Arial"/>
-          <w:sz w:val="20"/>
-          <w:szCs w:val="20"/>
-          <w:lang w:eastAsia="en-US"/>
-        </w:rPr>
-        <w:t xml:space="preserve"> na esteira que retornará ao início da linha;</w:t>
       </w:r>
     </w:p>
     <w:p>
@@ -3233,25 +3044,7 @@
           <w:szCs w:val="20"/>
           <w:lang w:eastAsia="en-US"/>
         </w:rPr>
-        <w:t xml:space="preserve">Sistema de visão computacional para inspeção óptica </w:t>
-      </w:r>
-      <w:r>
-        <w:rPr>
-          <w:rFonts w:eastAsia="Calibri" w:cs="Arial"/>
-          <w:sz w:val="20"/>
-          <w:szCs w:val="20"/>
-          <w:lang w:eastAsia="en-US"/>
-        </w:rPr>
-        <w:t>do produto</w:t>
-      </w:r>
-      <w:r>
-        <w:rPr>
-          <w:rFonts w:eastAsia="Calibri" w:cs="Arial"/>
-          <w:sz w:val="20"/>
-          <w:szCs w:val="20"/>
-          <w:lang w:eastAsia="en-US"/>
-        </w:rPr>
-        <w:t xml:space="preserve">; </w:t>
+        <w:t>Sistema de visão computacional aplicado apenas para verificar se a IHM está funcionando corretamente;</w:t>
       </w:r>
     </w:p>
     <w:p>
@@ -4445,7 +4238,7 @@
           <w:sz w:val="20"/>
           <w:szCs w:val="20"/>
         </w:rPr>
-        <w:t>Movimentação automática do produto para o módulo de tensão aplicada via esteira;</w:t>
+        <w:t>Movimentação automática do produto para o módulo de teste de tensão aplicada e funcional via esteira;</w:t>
       </w:r>
     </w:p>
     <w:p>
@@ -4491,7 +4284,7 @@
           <w:sz w:val="20"/>
           <w:szCs w:val="20"/>
         </w:rPr>
-        <w:t>Conexão elétrica/mecânica;</w:t>
+        <w:t>Conexão das conexões de potência;</w:t>
       </w:r>
     </w:p>
     <w:p>
@@ -4514,7 +4307,7 @@
           <w:sz w:val="20"/>
           <w:szCs w:val="20"/>
         </w:rPr>
-        <w:t>Execução do teste;</w:t>
+        <w:t>Execução do teste de tensão aplicada;</w:t>
       </w:r>
     </w:p>
     <w:p>
@@ -4537,7 +4330,7 @@
           <w:sz w:val="20"/>
           <w:szCs w:val="20"/>
         </w:rPr>
-        <w:t>Gravação de dados;</w:t>
+        <w:t>Conexão das conexões de controle/IO;</w:t>
       </w:r>
     </w:p>
     <w:p>
@@ -4560,7 +4353,7 @@
           <w:sz w:val="20"/>
           <w:szCs w:val="20"/>
         </w:rPr>
-        <w:t>Aprovação/reprovação;</w:t>
+        <w:t>Execução do teste funcional;</w:t>
       </w:r>
     </w:p>
     <w:p>
@@ -4583,7 +4376,7 @@
           <w:sz w:val="20"/>
           <w:szCs w:val="20"/>
         </w:rPr>
-        <w:t>Retorno à esteira;</w:t>
+        <w:t>Gravação de dados;</w:t>
       </w:r>
     </w:p>
     <w:p>
@@ -4606,7 +4399,7 @@
           <w:sz w:val="20"/>
           <w:szCs w:val="20"/>
         </w:rPr>
-        <w:t>Movimentação automática do produto para o módulo de teste funcional via esteira;</w:t>
+        <w:t>Aprovação/reprovação;</w:t>
       </w:r>
     </w:p>
     <w:p>
@@ -4629,7 +4422,7 @@
           <w:sz w:val="20"/>
           <w:szCs w:val="20"/>
         </w:rPr>
-        <w:t>Movimentação automática para a posição de teste;</w:t>
+        <w:t>Retorno à esteira;</w:t>
       </w:r>
     </w:p>
     <w:p>
@@ -4652,7 +4445,7 @@
           <w:sz w:val="20"/>
           <w:szCs w:val="20"/>
         </w:rPr>
-        <w:t>Conexão elétrica/mecânica;</w:t>
+        <w:t>Movimentação automática do produto para o módulo de teste de carga via esteira;</w:t>
       </w:r>
     </w:p>
     <w:p>
@@ -4675,7 +4468,7 @@
           <w:sz w:val="20"/>
           <w:szCs w:val="20"/>
         </w:rPr>
-        <w:t>Execução do teste;</w:t>
+        <w:t>Movimentação automática para a posição de teste;</w:t>
       </w:r>
     </w:p>
     <w:p>
@@ -4698,7 +4491,7 @@
           <w:sz w:val="20"/>
           <w:szCs w:val="20"/>
         </w:rPr>
-        <w:t>Gravação de dados;</w:t>
+        <w:t>Conexão elétrica/mecânica;</w:t>
       </w:r>
     </w:p>
     <w:p>
@@ -4721,7 +4514,7 @@
           <w:sz w:val="20"/>
           <w:szCs w:val="20"/>
         </w:rPr>
-        <w:t>Aprovação/reprovação;</w:t>
+        <w:t>Execução do teste;</w:t>
       </w:r>
     </w:p>
     <w:p>
@@ -4744,7 +4537,7 @@
           <w:sz w:val="20"/>
           <w:szCs w:val="20"/>
         </w:rPr>
-        <w:t>Retorno à esteira;</w:t>
+        <w:t>Gravação de dados;</w:t>
       </w:r>
     </w:p>
     <w:p>
@@ -4767,7 +4560,7 @@
           <w:sz w:val="20"/>
           <w:szCs w:val="20"/>
         </w:rPr>
-        <w:t>Movimentação automática do produto para o módulo de teste de carga via esteira;</w:t>
+        <w:t>Aprovação/reprovação;</w:t>
       </w:r>
     </w:p>
     <w:p>
@@ -4790,7 +4583,7 @@
           <w:sz w:val="20"/>
           <w:szCs w:val="20"/>
         </w:rPr>
-        <w:t>Movimentação automática para a posição de teste;</w:t>
+        <w:t>Retorno à esteira;</w:t>
       </w:r>
     </w:p>
     <w:p>
@@ -4813,163 +4606,7 @@
           <w:sz w:val="20"/>
           <w:szCs w:val="20"/>
         </w:rPr>
-        <w:t>Conexão elétrica/mecânica;</w:t>
-      </w:r>
-    </w:p>
-    <w:p>
-      <w:pPr>
-        <w:numPr>
-          <w:ilvl w:val="0"/>
-          <w:numId w:val="52"/>
-        </w:numPr>
-        <w:spacing w:line="360" w:lineRule="auto"/>
-        <w:jc w:val="center"/>
-        <w:rPr>
-          <w:rFonts w:cs="Arial"/>
-          <w:sz w:val="20"/>
-          <w:szCs w:val="20"/>
-        </w:rPr>
-      </w:pPr>
-      <w:r>
-        <w:rPr>
-          <w:rFonts w:cs="Arial"/>
-          <w:sz w:val="20"/>
-          <w:szCs w:val="20"/>
-        </w:rPr>
-        <w:t>Execução do teste;</w:t>
-      </w:r>
-    </w:p>
-    <w:p>
-      <w:pPr>
-        <w:numPr>
-          <w:ilvl w:val="0"/>
-          <w:numId w:val="52"/>
-        </w:numPr>
-        <w:spacing w:line="360" w:lineRule="auto"/>
-        <w:jc w:val="center"/>
-        <w:rPr>
-          <w:rFonts w:cs="Arial"/>
-          <w:sz w:val="20"/>
-          <w:szCs w:val="20"/>
-        </w:rPr>
-      </w:pPr>
-      <w:r>
-        <w:rPr>
-          <w:rFonts w:cs="Arial"/>
-          <w:sz w:val="20"/>
-          <w:szCs w:val="20"/>
-        </w:rPr>
-        <w:t>Gravação de dados;</w:t>
-      </w:r>
-    </w:p>
-    <w:p>
-      <w:pPr>
-        <w:numPr>
-          <w:ilvl w:val="0"/>
-          <w:numId w:val="52"/>
-        </w:numPr>
-        <w:spacing w:line="360" w:lineRule="auto"/>
-        <w:jc w:val="center"/>
-        <w:rPr>
-          <w:rFonts w:cs="Arial"/>
-          <w:sz w:val="20"/>
-          <w:szCs w:val="20"/>
-        </w:rPr>
-      </w:pPr>
-      <w:r>
-        <w:rPr>
-          <w:rFonts w:cs="Arial"/>
-          <w:sz w:val="20"/>
-          <w:szCs w:val="20"/>
-        </w:rPr>
-        <w:t>Aprovação/reprovação;</w:t>
-      </w:r>
-    </w:p>
-    <w:p>
-      <w:pPr>
-        <w:numPr>
-          <w:ilvl w:val="0"/>
-          <w:numId w:val="52"/>
-        </w:numPr>
-        <w:spacing w:line="360" w:lineRule="auto"/>
-        <w:jc w:val="center"/>
-        <w:rPr>
-          <w:rFonts w:cs="Arial"/>
-          <w:sz w:val="20"/>
-          <w:szCs w:val="20"/>
-        </w:rPr>
-      </w:pPr>
-      <w:r>
-        <w:rPr>
-          <w:rFonts w:cs="Arial"/>
-          <w:sz w:val="20"/>
-          <w:szCs w:val="20"/>
-        </w:rPr>
-        <w:t>Retorno à esteira;</w:t>
-      </w:r>
-    </w:p>
-    <w:p>
-      <w:pPr>
-        <w:numPr>
-          <w:ilvl w:val="0"/>
-          <w:numId w:val="52"/>
-        </w:numPr>
-        <w:spacing w:line="360" w:lineRule="auto"/>
-        <w:jc w:val="center"/>
-        <w:rPr>
-          <w:rFonts w:cs="Arial"/>
-          <w:sz w:val="20"/>
-          <w:szCs w:val="20"/>
-        </w:rPr>
-      </w:pPr>
-      <w:r>
-        <w:rPr>
-          <w:rFonts w:cs="Arial"/>
-          <w:sz w:val="20"/>
-          <w:szCs w:val="20"/>
-        </w:rPr>
         <w:t>Segregação final em embalagem ou reparo;</w:t>
-      </w:r>
-    </w:p>
-    <w:p>
-      <w:pPr>
-        <w:numPr>
-          <w:ilvl w:val="0"/>
-          <w:numId w:val="52"/>
-        </w:numPr>
-        <w:spacing w:line="360" w:lineRule="auto"/>
-        <w:jc w:val="center"/>
-        <w:rPr>
-          <w:rFonts w:cs="Arial"/>
-          <w:sz w:val="20"/>
-          <w:szCs w:val="20"/>
-        </w:rPr>
-      </w:pPr>
-      <w:proofErr w:type="spellStart"/>
-      <w:r>
-        <w:rPr>
-          <w:rFonts w:cs="Arial"/>
-          <w:sz w:val="20"/>
-          <w:szCs w:val="20"/>
-        </w:rPr>
-        <w:t>Fixtures</w:t>
-      </w:r>
-      <w:proofErr w:type="spellEnd"/>
-      <w:r>
-        <w:rPr>
-          <w:rFonts w:cs="Arial"/>
-          <w:sz w:val="20"/>
-          <w:szCs w:val="20"/>
-        </w:rPr>
-        <w:t xml:space="preserve"> são devolvidos para a esteira de retorno dos módulos</w:t>
-      </w:r>
-      <w:r>
-        <w:rPr>
-          <w:rFonts w:cs="Arial"/>
-          <w:sz w:val="20"/>
-          <w:szCs w:val="20"/>
-        </w:rPr>
-        <w:t>.</w:t>
       </w:r>
     </w:p>
     <w:p>
@@ -5103,112 +4740,10 @@
           <w:sz w:val="20"/>
           <w:szCs w:val="20"/>
         </w:rPr>
-        <w:t xml:space="preserve">Projetar, construir e instalar </w:t>
-      </w:r>
-      <w:r>
-        <w:rPr>
-          <w:rFonts w:ascii="Arial" w:hAnsi="Arial" w:cs="Arial"/>
-          <w:sz w:val="20"/>
-          <w:szCs w:val="20"/>
-        </w:rPr>
-        <w:t>um módulo de teste de tensão aplicada, um módulo de teste funcional e um módulo de teste de carga seguindo o conceito</w:t>
-      </w:r>
-      <w:r>
-        <w:rPr>
-          <w:rFonts w:ascii="Arial" w:hAnsi="Arial" w:cs="Arial"/>
-          <w:sz w:val="20"/>
-          <w:szCs w:val="20"/>
-        </w:rPr>
-        <w:t xml:space="preserve"> </w:t>
-      </w:r>
-      <w:r>
-        <w:rPr>
-          <w:rFonts w:ascii="Arial" w:hAnsi="Arial" w:cs="Arial"/>
-          <w:b/>
-          <w:bCs/>
-          <w:sz w:val="20"/>
-          <w:szCs w:val="20"/>
-        </w:rPr>
-        <w:t>M</w:t>
-      </w:r>
-      <w:r>
-        <w:rPr>
-          <w:rFonts w:ascii="Arial" w:hAnsi="Arial" w:cs="Arial"/>
-          <w:b/>
-          <w:bCs/>
-          <w:sz w:val="20"/>
-          <w:szCs w:val="20"/>
-        </w:rPr>
-        <w:t xml:space="preserve">odular </w:t>
+        <w:t>Projetar, construir e instalar um módulo combinado de teste de tensão aplicada e teste funcional e um módulo de teste de carga seguindo o conceito Modular All Drives de acordo com este descritivo e as normas aplicáveis;</w:t>
       </w:r>
       <w:proofErr w:type="spellStart"/>
-      <w:r>
-        <w:rPr>
-          <w:rFonts w:ascii="Arial" w:hAnsi="Arial" w:cs="Arial"/>
-          <w:b/>
-          <w:bCs/>
-          <w:sz w:val="20"/>
-          <w:szCs w:val="20"/>
-        </w:rPr>
-        <w:t>A</w:t>
-      </w:r>
-      <w:r>
-        <w:rPr>
-          <w:rFonts w:ascii="Arial" w:hAnsi="Arial" w:cs="Arial"/>
-          <w:b/>
-          <w:bCs/>
-          <w:sz w:val="20"/>
-          <w:szCs w:val="20"/>
-        </w:rPr>
-        <w:t>ll</w:t>
-      </w:r>
       <w:proofErr w:type="spellEnd"/>
-      <w:r>
-        <w:rPr>
-          <w:rFonts w:ascii="Arial" w:hAnsi="Arial" w:cs="Arial"/>
-          <w:b/>
-          <w:bCs/>
-          <w:sz w:val="20"/>
-          <w:szCs w:val="20"/>
-        </w:rPr>
-        <w:t xml:space="preserve"> </w:t>
-      </w:r>
-      <w:r>
-        <w:rPr>
-          <w:rFonts w:ascii="Arial" w:hAnsi="Arial" w:cs="Arial"/>
-          <w:b/>
-          <w:bCs/>
-          <w:sz w:val="20"/>
-          <w:szCs w:val="20"/>
-        </w:rPr>
-        <w:t>D</w:t>
-      </w:r>
-      <w:r>
-        <w:rPr>
-          <w:rFonts w:ascii="Arial" w:hAnsi="Arial" w:cs="Arial"/>
-          <w:b/>
-          <w:bCs/>
-          <w:sz w:val="20"/>
-          <w:szCs w:val="20"/>
-        </w:rPr>
-        <w:t>rives</w:t>
-      </w:r>
-      <w:r>
-        <w:rPr>
-          <w:rFonts w:ascii="Arial" w:hAnsi="Arial" w:cs="Arial"/>
-          <w:sz w:val="20"/>
-          <w:szCs w:val="20"/>
-        </w:rPr>
-        <w:t xml:space="preserve"> de acordo com este descritivo e as normas aplicáveis</w:t>
-      </w:r>
-      <w:r>
-        <w:rPr>
-          <w:rFonts w:ascii="Arial" w:hAnsi="Arial" w:cs="Arial"/>
-          <w:sz w:val="20"/>
-          <w:szCs w:val="20"/>
-        </w:rPr>
-        <w:t>;</w:t>
-      </w:r>
     </w:p>
     <w:p>
       <w:pPr>

</xml_diff>